<commit_message>
datastructures examples and project activity
</commit_message>
<xml_diff>
--- a/Phase 2 Datastructures with JS.docx
+++ b/Phase 2 Datastructures with JS.docx
@@ -136,7 +136,15 @@
         </w:numPr>
       </w:pPr>
       <w:r>
-        <w:t>Primitive types : string, number, boolean</w:t>
+        <w:t xml:space="preserve">Primitive </w:t>
+      </w:r>
+      <w:proofErr w:type="gramStart"/>
+      <w:r>
+        <w:t>types :</w:t>
+      </w:r>
+      <w:proofErr w:type="gramEnd"/>
+      <w:r>
+        <w:t xml:space="preserve"> string, number, boolean</w:t>
       </w:r>
     </w:p>
     <w:p>
@@ -210,7 +218,23 @@
         </w:numPr>
       </w:pPr>
       <w:r>
-        <w:t>Map: A collection that maintain the data in key &amp; value pairs, ex: maintain database details {username : admin, password :  admin123}</w:t>
+        <w:t>Map: A collection that maintain the data in key &amp; value pairs, ex: maintain database details {</w:t>
+      </w:r>
+      <w:proofErr w:type="gramStart"/>
+      <w:r>
+        <w:t>username :</w:t>
+      </w:r>
+      <w:proofErr w:type="gramEnd"/>
+      <w:r>
+        <w:t xml:space="preserve"> admin, </w:t>
+      </w:r>
+      <w:proofErr w:type="gramStart"/>
+      <w:r>
+        <w:t>password :</w:t>
+      </w:r>
+      <w:proofErr w:type="gramEnd"/>
+      <w:r>
+        <w:t xml:space="preserve">  admin123}</w:t>
       </w:r>
     </w:p>
     <w:p>
@@ -262,7 +286,15 @@
         <w:t>Algorithms:</w:t>
       </w:r>
       <w:r>
-        <w:t xml:space="preserve"> These are step by step instructions written in a human understandable language before writing the actual code, then  you can implement them in different languages like Java, Javascript, C, C++</w:t>
+        <w:t xml:space="preserve"> These are step by step instructions written in a human understandable language before writing the actual code, </w:t>
+      </w:r>
+      <w:proofErr w:type="gramStart"/>
+      <w:r>
+        <w:t>then  you</w:t>
+      </w:r>
+      <w:proofErr w:type="gramEnd"/>
+      <w:r>
+        <w:t xml:space="preserve"> can implement them in different languages like Java, Javascript, C, C++</w:t>
       </w:r>
     </w:p>
     <w:p>
@@ -495,8 +527,13 @@
           <w:numId w:val="6"/>
         </w:numPr>
       </w:pPr>
-      <w:r>
-        <w:t>add() : It is to add an element you pass to the Set</w:t>
+      <w:proofErr w:type="gramStart"/>
+      <w:r>
+        <w:t>add() :</w:t>
+      </w:r>
+      <w:proofErr w:type="gramEnd"/>
+      <w:r>
+        <w:t xml:space="preserve"> It is to add an element you pass to the Set</w:t>
       </w:r>
     </w:p>
     <w:p>
@@ -507,8 +544,13 @@
           <w:numId w:val="6"/>
         </w:numPr>
       </w:pPr>
-      <w:r>
-        <w:t>delete() : It removes an element you pass from the Set</w:t>
+      <w:proofErr w:type="gramStart"/>
+      <w:r>
+        <w:t>delete() :</w:t>
+      </w:r>
+      <w:proofErr w:type="gramEnd"/>
+      <w:r>
+        <w:t xml:space="preserve"> It removes an element you pass from the Set</w:t>
       </w:r>
     </w:p>
     <w:p>
@@ -519,9 +561,14 @@
           <w:numId w:val="6"/>
         </w:numPr>
       </w:pPr>
+      <w:proofErr w:type="gramStart"/>
       <w:r>
         <w:lastRenderedPageBreak/>
-        <w:t xml:space="preserve">clear(): It removes all the elements </w:t>
+        <w:t>clear(</w:t>
+      </w:r>
+      <w:proofErr w:type="gramEnd"/>
+      <w:r>
+        <w:t xml:space="preserve">): It removes all the elements </w:t>
       </w:r>
     </w:p>
     <w:p>
@@ -532,8 +579,13 @@
           <w:numId w:val="6"/>
         </w:numPr>
       </w:pPr>
-      <w:r>
-        <w:t>has(): It checks if the element is present or not in the Set</w:t>
+      <w:proofErr w:type="gramStart"/>
+      <w:r>
+        <w:t>has(</w:t>
+      </w:r>
+      <w:proofErr w:type="gramEnd"/>
+      <w:r>
+        <w:t>): It checks if the element is present or not in the Set</w:t>
       </w:r>
     </w:p>
     <w:p>
@@ -545,7 +597,15 @@
         </w:numPr>
       </w:pPr>
       <w:r>
-        <w:t>size: It is property to check the size of the Set, how many elements are present.</w:t>
+        <w:t xml:space="preserve">size: It is property to check the size of the </w:t>
+      </w:r>
+      <w:proofErr w:type="gramStart"/>
+      <w:r>
+        <w:t>Set,</w:t>
+      </w:r>
+      <w:proofErr w:type="gramEnd"/>
+      <w:r>
+        <w:t xml:space="preserve"> how many elements are present.</w:t>
       </w:r>
     </w:p>
     <w:p>
@@ -569,7 +629,15 @@
         <w:ind w:left="0" w:firstLine="0"/>
       </w:pPr>
       <w:r>
-        <w:t xml:space="preserve">let names = new Set(); </w:t>
+        <w:t xml:space="preserve">let names = new </w:t>
+      </w:r>
+      <w:proofErr w:type="gramStart"/>
+      <w:r>
+        <w:t>Set(</w:t>
+      </w:r>
+      <w:proofErr w:type="gramEnd"/>
+      <w:r>
+        <w:t xml:space="preserve">); </w:t>
       </w:r>
     </w:p>
     <w:p>
@@ -605,15 +673,36 @@
         <w:ind w:left="0" w:firstLine="0"/>
       </w:pPr>
       <w:r>
-        <w:t>console.log(names.has(“HP”)) ; // true if present else false</w:t>
-      </w:r>
-    </w:p>
-    <w:p>
-      <w:pPr>
-        <w:ind w:left="0" w:firstLine="0"/>
-      </w:pPr>
-      <w:r>
-        <w:t>names.delete(“Dell”); // deletes the element Dell</w:t>
+        <w:t>console.log(</w:t>
+      </w:r>
+      <w:proofErr w:type="spellStart"/>
+      <w:r>
+        <w:t>names.has</w:t>
+      </w:r>
+      <w:proofErr w:type="spellEnd"/>
+      <w:r>
+        <w:t>(“HP”)</w:t>
+      </w:r>
+      <w:proofErr w:type="gramStart"/>
+      <w:r>
+        <w:t>) ;</w:t>
+      </w:r>
+      <w:proofErr w:type="gramEnd"/>
+      <w:r>
+        <w:t xml:space="preserve"> // true if present else false</w:t>
+      </w:r>
+    </w:p>
+    <w:p>
+      <w:pPr>
+        <w:ind w:left="0" w:firstLine="0"/>
+      </w:pPr>
+      <w:proofErr w:type="gramStart"/>
+      <w:r>
+        <w:t>names.delete</w:t>
+      </w:r>
+      <w:proofErr w:type="gramEnd"/>
+      <w:r>
+        <w:t>(“Dell”); // deletes the element Dell</w:t>
       </w:r>
     </w:p>
     <w:p>
@@ -807,8 +896,21 @@
           <w:numId w:val="6"/>
         </w:numPr>
       </w:pPr>
-      <w:r>
-        <w:t>set(key, value) : Add / Update</w:t>
+      <w:proofErr w:type="gramStart"/>
+      <w:r>
+        <w:t>set(</w:t>
+      </w:r>
+      <w:proofErr w:type="gramEnd"/>
+      <w:r>
+        <w:t>key, value</w:t>
+      </w:r>
+      <w:proofErr w:type="gramStart"/>
+      <w:r>
+        <w:t>) :</w:t>
+      </w:r>
+      <w:proofErr w:type="gramEnd"/>
+      <w:r>
+        <w:t xml:space="preserve"> Add / Update</w:t>
       </w:r>
     </w:p>
     <w:p>
@@ -855,8 +957,13 @@
           <w:numId w:val="6"/>
         </w:numPr>
       </w:pPr>
-      <w:r>
-        <w:t>clear(): To delete all</w:t>
+      <w:proofErr w:type="gramStart"/>
+      <w:r>
+        <w:t>clear(</w:t>
+      </w:r>
+      <w:proofErr w:type="gramEnd"/>
+      <w:r>
+        <w:t>): To delete all</w:t>
       </w:r>
     </w:p>
     <w:p>
@@ -876,23 +983,82 @@
         <w:ind w:left="0" w:firstLine="0"/>
       </w:pPr>
       <w:r>
-        <w:t>let employeeMap = new Map();</w:t>
-      </w:r>
-    </w:p>
-    <w:p>
-      <w:pPr>
-        <w:ind w:left="0" w:firstLine="0"/>
-      </w:pPr>
-      <w:r>
-        <w:t>employeeMap.set(1, { id: 1, name : “Alex” });</w:t>
+        <w:t xml:space="preserve">let employeeMap = new </w:t>
+      </w:r>
+      <w:proofErr w:type="gramStart"/>
+      <w:r>
+        <w:t>Map(</w:t>
+      </w:r>
+      <w:proofErr w:type="gramEnd"/>
+      <w:r>
+        <w:t>);</w:t>
+      </w:r>
+    </w:p>
+    <w:p>
+      <w:pPr>
+        <w:ind w:left="0" w:firstLine="0"/>
+      </w:pPr>
+      <w:proofErr w:type="gramStart"/>
+      <w:r>
+        <w:t>employeeMap.set(</w:t>
+      </w:r>
+      <w:proofErr w:type="gramEnd"/>
+      <w:r>
+        <w:t xml:space="preserve">1, </w:t>
+      </w:r>
+      <w:proofErr w:type="gramStart"/>
+      <w:r>
+        <w:t>{ id</w:t>
+      </w:r>
+      <w:proofErr w:type="gramEnd"/>
+      <w:r>
+        <w:t xml:space="preserve">: 1, </w:t>
+      </w:r>
+      <w:proofErr w:type="gramStart"/>
+      <w:r>
+        <w:t>name :</w:t>
+      </w:r>
+      <w:proofErr w:type="gramEnd"/>
+      <w:r>
+        <w:t xml:space="preserve"> “Alex” });</w:t>
       </w:r>
       <w:r>
         <w:br/>
-        <w:t>employeeMap.set(2, {id : 2, name : “Bruce”});</w:t>
+      </w:r>
+      <w:proofErr w:type="gramStart"/>
+      <w:r>
+        <w:t>employeeMap.set(</w:t>
+      </w:r>
+      <w:proofErr w:type="gramEnd"/>
+      <w:r>
+        <w:t>2, {</w:t>
+      </w:r>
+      <w:proofErr w:type="gramStart"/>
+      <w:r>
+        <w:t>id :</w:t>
+      </w:r>
+      <w:proofErr w:type="gramEnd"/>
+      <w:r>
+        <w:t xml:space="preserve"> 2, </w:t>
+      </w:r>
+      <w:proofErr w:type="gramStart"/>
+      <w:r>
+        <w:t>name :</w:t>
+      </w:r>
+      <w:proofErr w:type="gramEnd"/>
+      <w:r>
+        <w:t xml:space="preserve"> “Bruce”});</w:t>
       </w:r>
       <w:r>
         <w:br/>
-        <w:t>employeeMap.get(1); // returns the value associated with the key 1</w:t>
+      </w:r>
+      <w:proofErr w:type="gramStart"/>
+      <w:r>
+        <w:t>employeeMap.get(</w:t>
+      </w:r>
+      <w:proofErr w:type="gramEnd"/>
+      <w:r>
+        <w:t>1); // returns the value associated with the key 1</w:t>
       </w:r>
     </w:p>
     <w:p>
@@ -1031,8 +1197,13 @@
           <w:numId w:val="6"/>
         </w:numPr>
       </w:pPr>
-      <w:r>
-        <w:t>pop(): removes from the end</w:t>
+      <w:proofErr w:type="gramStart"/>
+      <w:r>
+        <w:t>pop(</w:t>
+      </w:r>
+      <w:proofErr w:type="gramEnd"/>
+      <w:r>
+        <w:t>): removes from the end</w:t>
       </w:r>
     </w:p>
     <w:p>
@@ -1043,8 +1214,13 @@
           <w:numId w:val="6"/>
         </w:numPr>
       </w:pPr>
-      <w:r>
-        <w:t>shift(): removes from the beginning</w:t>
+      <w:proofErr w:type="gramStart"/>
+      <w:r>
+        <w:t>shift(</w:t>
+      </w:r>
+      <w:proofErr w:type="gramEnd"/>
+      <w:r>
+        <w:t>): removes from the beginning</w:t>
       </w:r>
     </w:p>
     <w:p>
@@ -1055,8 +1231,13 @@
           <w:numId w:val="6"/>
         </w:numPr>
       </w:pPr>
-      <w:r>
-        <w:t>slice(): to get a subarray</w:t>
+      <w:proofErr w:type="gramStart"/>
+      <w:r>
+        <w:t>slice(</w:t>
+      </w:r>
+      <w:proofErr w:type="gramEnd"/>
+      <w:r>
+        <w:t>): to get a subarray</w:t>
       </w:r>
     </w:p>
     <w:p>
@@ -1067,8 +1248,13 @@
           <w:numId w:val="6"/>
         </w:numPr>
       </w:pPr>
-      <w:r>
-        <w:t>filter(): to get an array that matches to the filter/condition</w:t>
+      <w:proofErr w:type="gramStart"/>
+      <w:r>
+        <w:t>filter(</w:t>
+      </w:r>
+      <w:proofErr w:type="gramEnd"/>
+      <w:r>
+        <w:t>): to get an array that matches to the filter/condition</w:t>
       </w:r>
     </w:p>
     <w:p>
@@ -1079,8 +1265,13 @@
           <w:numId w:val="6"/>
         </w:numPr>
       </w:pPr>
-      <w:r>
-        <w:t>reduce(): combines into one value - reduces an array into anything like number, object</w:t>
+      <w:proofErr w:type="gramStart"/>
+      <w:r>
+        <w:t>reduce(</w:t>
+      </w:r>
+      <w:proofErr w:type="gramEnd"/>
+      <w:r>
+        <w:t>): combines into one value - reduces an array into anything like number, object</w:t>
       </w:r>
     </w:p>
     <w:p>
@@ -1509,6 +1700,7 @@
       <w:pPr>
         <w:ind w:left="0" w:firstLine="0"/>
       </w:pPr>
+      <w:proofErr w:type="gramStart"/>
       <w:r>
         <w:t xml:space="preserve">arrays.reduce( </w:t>
       </w:r>
@@ -1516,8 +1708,37 @@
         <w:rPr>
           <w:color w:val="EE0000"/>
         </w:rPr>
-        <w:t>(accumulator, currentValue) =&gt; { /* do something */ }</w:t>
-      </w:r>
+        <w:t>(</w:t>
+      </w:r>
+      <w:proofErr w:type="gramEnd"/>
+      <w:r>
+        <w:rPr>
+          <w:color w:val="EE0000"/>
+        </w:rPr>
+        <w:t xml:space="preserve">accumulator, currentValue) =&gt; </w:t>
+      </w:r>
+      <w:proofErr w:type="gramStart"/>
+      <w:r>
+        <w:rPr>
+          <w:color w:val="EE0000"/>
+        </w:rPr>
+        <w:t>{ /</w:t>
+      </w:r>
+      <w:proofErr w:type="gramEnd"/>
+      <w:r>
+        <w:rPr>
+          <w:color w:val="EE0000"/>
+        </w:rPr>
+        <w:t>* do something *</w:t>
+      </w:r>
+      <w:proofErr w:type="gramStart"/>
+      <w:r>
+        <w:rPr>
+          <w:color w:val="EE0000"/>
+        </w:rPr>
+        <w:t>/ }</w:t>
+      </w:r>
+      <w:proofErr w:type="gramEnd"/>
       <w:r>
         <w:t xml:space="preserve">, </w:t>
       </w:r>
@@ -1770,7 +1991,15 @@
         <w:ind w:left="0" w:firstLine="0"/>
       </w:pPr>
       <w:r>
-        <w:t>Assume you have a server logs of payments that is SUCCESS or FAIL and you want to display the count of SUCCESS/FAIL.</w:t>
+        <w:t xml:space="preserve">Assume you have a </w:t>
+      </w:r>
+      <w:proofErr w:type="gramStart"/>
+      <w:r>
+        <w:t>server logs of payments</w:t>
+      </w:r>
+      <w:proofErr w:type="gramEnd"/>
+      <w:r>
+        <w:t xml:space="preserve"> that is SUCCESS or FAIL and you want to display the count of SUCCESS/FAIL.</w:t>
       </w:r>
     </w:p>
     <w:p>
@@ -1967,9 +2196,19 @@
       </w:r>
     </w:p>
     <w:p>
-      <w:r>
-        <w:t>[ ]  [X] [ ]</w:t>
-      </w:r>
+      <w:proofErr w:type="gramStart"/>
+      <w:r>
+        <w:t>[ ]</w:t>
+      </w:r>
+      <w:proofErr w:type="gramEnd"/>
+      <w:r>
+        <w:t xml:space="preserve">  [X] </w:t>
+      </w:r>
+      <w:proofErr w:type="gramStart"/>
+      <w:r>
+        <w:t>[ ]</w:t>
+      </w:r>
+      <w:proofErr w:type="gramEnd"/>
     </w:p>
     <w:p>
       <w:r>
@@ -2540,7 +2779,15 @@
       </w:r>
       <w:r>
         <w:br/>
-        <w:t xml:space="preserve">     this.data = data;</w:t>
+        <w:t xml:space="preserve">     </w:t>
+      </w:r>
+      <w:proofErr w:type="spellStart"/>
+      <w:r>
+        <w:t>this.data</w:t>
+      </w:r>
+      <w:proofErr w:type="spellEnd"/>
+      <w:r>
+        <w:t xml:space="preserve"> = data;</w:t>
       </w:r>
     </w:p>
     <w:p>
@@ -2553,8 +2800,15 @@
       <w:r>
         <w:t xml:space="preserve"> </w:t>
       </w:r>
-      <w:r>
-        <w:t>this.next = null;</w:t>
+      <w:proofErr w:type="spellStart"/>
+      <w:proofErr w:type="gramStart"/>
+      <w:r>
+        <w:t>this.next</w:t>
+      </w:r>
+      <w:proofErr w:type="spellEnd"/>
+      <w:proofErr w:type="gramEnd"/>
+      <w:r>
+        <w:t xml:space="preserve"> = null;</w:t>
       </w:r>
       <w:r>
         <w:br/>
@@ -2686,6 +2940,7 @@
       <w:pPr>
         <w:ind w:left="0" w:firstLine="0"/>
       </w:pPr>
+      <w:proofErr w:type="spellStart"/>
       <w:r>
         <w:rPr>
           <w:highlight w:val="yellow"/>
@@ -2704,13 +2959,22 @@
         </w:rPr>
         <w:t>LinkedList</w:t>
       </w:r>
-    </w:p>
-    <w:p>
-      <w:pPr>
-        <w:ind w:left="0" w:firstLine="0"/>
-      </w:pPr>
-      <w:r>
-        <w:t>Add &amp; Display the data</w:t>
+      <w:proofErr w:type="spellEnd"/>
+    </w:p>
+    <w:p>
+      <w:pPr>
+        <w:ind w:left="0" w:firstLine="0"/>
+      </w:pPr>
+      <w:r>
+        <w:t xml:space="preserve">Add &amp; </w:t>
+      </w:r>
+      <w:proofErr w:type="gramStart"/>
+      <w:r>
+        <w:t>Display</w:t>
+      </w:r>
+      <w:proofErr w:type="gramEnd"/>
+      <w:r>
+        <w:t xml:space="preserve"> the data</w:t>
       </w:r>
     </w:p>
     <w:p>
@@ -3126,7 +3390,15 @@
         <w:ind w:left="0" w:firstLine="0"/>
       </w:pPr>
       <w:r>
-        <w:t>Create delete(data) function in the SingleLinkedList which removes the element in the LinkedList</w:t>
+        <w:t xml:space="preserve">Create delete(data) function in the </w:t>
+      </w:r>
+      <w:proofErr w:type="spellStart"/>
+      <w:r>
+        <w:t>SingleLinkedList</w:t>
+      </w:r>
+      <w:proofErr w:type="spellEnd"/>
+      <w:r>
+        <w:t xml:space="preserve"> which removes the element in the LinkedList</w:t>
       </w:r>
     </w:p>
     <w:p>
@@ -3276,7 +3548,21 @@
         <w:rPr>
           <w:highlight w:val="yellow"/>
         </w:rPr>
-        <w:t>Add, Display Forward  &amp; Display Backward</w:t>
+        <w:t xml:space="preserve">Add, Display </w:t>
+      </w:r>
+      <w:proofErr w:type="gramStart"/>
+      <w:r>
+        <w:rPr>
+          <w:highlight w:val="yellow"/>
+        </w:rPr>
+        <w:t>Forward  &amp;</w:t>
+      </w:r>
+      <w:proofErr w:type="gramEnd"/>
+      <w:r>
+        <w:rPr>
+          <w:highlight w:val="yellow"/>
+        </w:rPr>
+        <w:t xml:space="preserve"> Display Backward</w:t>
       </w:r>
     </w:p>
     <w:p>
@@ -3520,7 +3806,39 @@
         <w:ind w:left="0" w:firstLine="0"/>
       </w:pPr>
       <w:r>
-        <w:t>Currently, the DoublyLinkedList has a head pointer that points to the first node. Create another pointer called tail that moves along with the newly added nodes. Rewrite displayBackward() so that it directly starts from the tail and moves backward using the prev pointer. Implement removeFirst() such that the first node is removed and head points to the next node. Similarly, implement removeLast() so that the last node is removed and tail moves backward to point to the previous node of the deleted node.</w:t>
+        <w:t xml:space="preserve">Currently, the DoublyLinkedList has a head pointer that points to the first node. Create another pointer called tail that moves along with the newly added nodes. Rewrite </w:t>
+      </w:r>
+      <w:proofErr w:type="gramStart"/>
+      <w:r>
+        <w:t>displayBackward(</w:t>
+      </w:r>
+      <w:proofErr w:type="gramEnd"/>
+      <w:r>
+        <w:t xml:space="preserve">) so that it directly starts from the tail and moves backward using the </w:t>
+      </w:r>
+      <w:proofErr w:type="spellStart"/>
+      <w:r>
+        <w:t>prev</w:t>
+      </w:r>
+      <w:proofErr w:type="spellEnd"/>
+      <w:r>
+        <w:t xml:space="preserve"> pointer. Implement </w:t>
+      </w:r>
+      <w:proofErr w:type="gramStart"/>
+      <w:r>
+        <w:t>removeFirst(</w:t>
+      </w:r>
+      <w:proofErr w:type="gramEnd"/>
+      <w:r>
+        <w:t xml:space="preserve">) such that the first node is removed and head points to the next node. Similarly, implement </w:t>
+      </w:r>
+      <w:proofErr w:type="gramStart"/>
+      <w:r>
+        <w:t>removeLast(</w:t>
+      </w:r>
+      <w:proofErr w:type="gramEnd"/>
+      <w:r>
+        <w:t>) so that the last node is removed and tail moves backward to point to the previous node of the deleted node.</w:t>
       </w:r>
     </w:p>
     <w:p>
@@ -3954,12 +4272,44 @@
       <w:pPr>
         <w:ind w:left="0" w:firstLine="0"/>
       </w:pPr>
-      <w:r>
-        <w:t>this.head = newNode;</w:t>
+      <w:proofErr w:type="spellStart"/>
+      <w:proofErr w:type="gramStart"/>
+      <w:r>
+        <w:t>this.head</w:t>
+      </w:r>
+      <w:proofErr w:type="spellEnd"/>
+      <w:proofErr w:type="gramEnd"/>
+      <w:r>
+        <w:t xml:space="preserve"> = </w:t>
+      </w:r>
+      <w:proofErr w:type="spellStart"/>
+      <w:r>
+        <w:t>newNode</w:t>
+      </w:r>
+      <w:proofErr w:type="spellEnd"/>
+      <w:r>
+        <w:t>;</w:t>
       </w:r>
       <w:r>
         <w:br/>
-        <w:t>newNode.next = this.head;</w:t>
+      </w:r>
+      <w:proofErr w:type="spellStart"/>
+      <w:r>
+        <w:t>newNode.next</w:t>
+      </w:r>
+      <w:proofErr w:type="spellEnd"/>
+      <w:r>
+        <w:t xml:space="preserve"> = </w:t>
+      </w:r>
+      <w:proofErr w:type="spellStart"/>
+      <w:proofErr w:type="gramStart"/>
+      <w:r>
+        <w:t>this.head</w:t>
+      </w:r>
+      <w:proofErr w:type="spellEnd"/>
+      <w:proofErr w:type="gramEnd"/>
+      <w:r>
+        <w:t>;</w:t>
       </w:r>
     </w:p>
     <w:p>
@@ -3973,7 +4323,31 @@
         <w:t>Displaying</w:t>
       </w:r>
       <w:r>
-        <w:t>: We can’t use while(current !== null) because null never comes, we use do { } while(current !== head)</w:t>
+        <w:t xml:space="preserve">: We can’t use </w:t>
+      </w:r>
+      <w:proofErr w:type="gramStart"/>
+      <w:r>
+        <w:t>while(current !</w:t>
+      </w:r>
+      <w:proofErr w:type="gramEnd"/>
+      <w:r>
+        <w:t xml:space="preserve">== null) because null never comes, we use do </w:t>
+      </w:r>
+      <w:proofErr w:type="gramStart"/>
+      <w:r>
+        <w:t>{ }</w:t>
+      </w:r>
+      <w:proofErr w:type="gramEnd"/>
+      <w:r>
+        <w:t xml:space="preserve"> </w:t>
+      </w:r>
+      <w:proofErr w:type="gramStart"/>
+      <w:r>
+        <w:t>while(current !</w:t>
+      </w:r>
+      <w:proofErr w:type="gramEnd"/>
+      <w:r>
+        <w:t>== head)</w:t>
       </w:r>
     </w:p>
     <w:p>
@@ -4284,7 +4658,15 @@
         <w:ind w:left="0" w:firstLine="0"/>
       </w:pPr>
       <w:r>
-        <w:t>Ex: ticket counters, call centres, print jobs</w:t>
+        <w:t xml:space="preserve">Ex: ticket counters, call </w:t>
+      </w:r>
+      <w:proofErr w:type="spellStart"/>
+      <w:r>
+        <w:t>centres</w:t>
+      </w:r>
+      <w:proofErr w:type="spellEnd"/>
+      <w:r>
+        <w:t>, print jobs</w:t>
       </w:r>
     </w:p>
     <w:p>
@@ -4359,6 +4741,9 @@
         <w:ind w:left="0" w:firstLine="0"/>
       </w:pPr>
       <w:r>
+        <w:rPr>
+          <w:noProof/>
+        </w:rPr>
         <w:lastRenderedPageBreak/>
         <w:drawing>
           <wp:inline distT="0" distB="0" distL="0" distR="0" wp14:anchorId="4F58F036" wp14:editId="29E1408D">
@@ -4397,6 +4782,9 @@
         </w:drawing>
       </w:r>
       <w:r>
+        <w:rPr>
+          <w:noProof/>
+        </w:rPr>
         <w:lastRenderedPageBreak/>
         <w:drawing>
           <wp:inline distT="0" distB="0" distL="0" distR="0" wp14:anchorId="0697FBAC" wp14:editId="08A91C22">
@@ -4451,6 +4839,9 @@
         <w:ind w:left="0" w:firstLine="0"/>
       </w:pPr>
       <w:r>
+        <w:rPr>
+          <w:noProof/>
+        </w:rPr>
         <w:lastRenderedPageBreak/>
         <w:drawing>
           <wp:inline distT="0" distB="0" distL="0" distR="0" wp14:anchorId="6AF99786" wp14:editId="5D1939BB">
@@ -4505,6 +4896,9 @@
         <w:ind w:left="0" w:firstLine="0"/>
       </w:pPr>
       <w:r>
+        <w:rPr>
+          <w:noProof/>
+        </w:rPr>
         <w:lastRenderedPageBreak/>
         <w:drawing>
           <wp:inline distT="0" distB="0" distL="0" distR="0" wp14:anchorId="6BB6B7C4" wp14:editId="66C032BE">
@@ -4543,6 +4937,9 @@
         </w:drawing>
       </w:r>
       <w:r>
+        <w:rPr>
+          <w:noProof/>
+        </w:rPr>
         <w:lastRenderedPageBreak/>
         <w:drawing>
           <wp:inline distT="0" distB="0" distL="0" distR="0" wp14:anchorId="0B3CEE41" wp14:editId="377F8341">
@@ -4597,6 +4994,9 @@
         <w:ind w:left="0" w:firstLine="0"/>
       </w:pPr>
       <w:r>
+        <w:rPr>
+          <w:noProof/>
+        </w:rPr>
         <w:drawing>
           <wp:inline distT="0" distB="0" distL="0" distR="0" wp14:anchorId="0FF76C9F" wp14:editId="76789F78">
             <wp:extent cx="5943600" cy="953770"/>
@@ -4909,8 +5309,13 @@
             <w:pPr>
               <w:ind w:left="0" w:firstLine="0"/>
             </w:pPr>
+            <w:proofErr w:type="gramStart"/>
             <w:r>
-              <w:t>Closing ) mismatches opening [</w:t>
+              <w:t>Closing )</w:t>
+            </w:r>
+            <w:proofErr w:type="gramEnd"/>
+            <w:r>
+              <w:t xml:space="preserve"> mismatches opening [</w:t>
             </w:r>
           </w:p>
         </w:tc>
@@ -5013,11 +5418,19 @@
       <w:pPr>
         <w:ind w:left="0" w:firstLine="0"/>
       </w:pPr>
-      <w:r>
-        <w:rPr>
-          <w:highlight w:val="yellow"/>
-        </w:rPr>
-        <w:t>Non linear datastructure</w:t>
+      <w:proofErr w:type="spellStart"/>
+      <w:r>
+        <w:rPr>
+          <w:highlight w:val="yellow"/>
+        </w:rPr>
+        <w:t>Non linear</w:t>
+      </w:r>
+      <w:proofErr w:type="spellEnd"/>
+      <w:r>
+        <w:rPr>
+          <w:highlight w:val="yellow"/>
+        </w:rPr>
+        <w:t xml:space="preserve"> datastructure</w:t>
       </w:r>
     </w:p>
     <w:p>
@@ -5057,6 +5470,9 @@
         <w:ind w:left="0" w:firstLine="0"/>
       </w:pPr>
       <w:r>
+        <w:rPr>
+          <w:noProof/>
+        </w:rPr>
         <w:lastRenderedPageBreak/>
         <w:drawing>
           <wp:inline distT="0" distB="0" distL="0" distR="0" wp14:anchorId="6E7C1CB2" wp14:editId="432855E7">
@@ -5116,6 +5532,9 @@
         <w:ind w:left="0" w:firstLine="0"/>
       </w:pPr>
       <w:r>
+        <w:rPr>
+          <w:noProof/>
+        </w:rPr>
         <w:lastRenderedPageBreak/>
         <w:drawing>
           <wp:inline distT="0" distB="0" distL="0" distR="0" wp14:anchorId="5B40DE1A" wp14:editId="62957D7C">
@@ -5202,6 +5621,9 @@
         <w:ind w:firstLine="0"/>
       </w:pPr>
       <w:r>
+        <w:rPr>
+          <w:noProof/>
+        </w:rPr>
         <w:lastRenderedPageBreak/>
         <w:drawing>
           <wp:inline distT="0" distB="0" distL="0" distR="0" wp14:anchorId="65C1F350" wp14:editId="13A7F2D2">
@@ -5267,6 +5689,9 @@
         <w:ind w:firstLine="0"/>
       </w:pPr>
       <w:r>
+        <w:rPr>
+          <w:noProof/>
+        </w:rPr>
         <w:lastRenderedPageBreak/>
         <w:drawing>
           <wp:inline distT="0" distB="0" distL="0" distR="0" wp14:anchorId="6CA68059" wp14:editId="4746582C">
@@ -5314,7 +5739,23 @@
         <w:t>Helps to find shortest path, Google maps use graph</w:t>
       </w:r>
       <w:r>
-        <w:t>, social media friends like whatsapp/facebook, you connect to friend1, friend2, friend3, they connect to others</w:t>
+        <w:t xml:space="preserve">, social media friends like </w:t>
+      </w:r>
+      <w:proofErr w:type="spellStart"/>
+      <w:r>
+        <w:t>whatsapp</w:t>
+      </w:r>
+      <w:proofErr w:type="spellEnd"/>
+      <w:r>
+        <w:t>/</w:t>
+      </w:r>
+      <w:proofErr w:type="spellStart"/>
+      <w:r>
+        <w:t>facebook</w:t>
+      </w:r>
+      <w:proofErr w:type="spellEnd"/>
+      <w:r>
+        <w:t>, you connect to friend1, friend2, friend3, they connect to others</w:t>
       </w:r>
     </w:p>
     <w:p>
@@ -5541,6 +5982,9 @@
         <w:ind w:left="360" w:firstLine="0"/>
       </w:pPr>
       <w:r>
+        <w:rPr>
+          <w:noProof/>
+        </w:rPr>
         <w:drawing>
           <wp:inline distT="0" distB="0" distL="0" distR="0" wp14:anchorId="63977D8D" wp14:editId="096E6547">
             <wp:extent cx="5943600" cy="3509645"/>
@@ -5594,6 +6038,9 @@
         <w:ind w:left="360" w:firstLine="0"/>
       </w:pPr>
       <w:r>
+        <w:rPr>
+          <w:noProof/>
+        </w:rPr>
         <w:lastRenderedPageBreak/>
         <w:drawing>
           <wp:inline distT="0" distB="0" distL="0" distR="0" wp14:anchorId="244DFAC7" wp14:editId="0B7F6EA0">
@@ -5637,6 +6084,9 @@
         <w:ind w:left="360" w:firstLine="0"/>
       </w:pPr>
       <w:r>
+        <w:rPr>
+          <w:noProof/>
+        </w:rPr>
         <w:lastRenderedPageBreak/>
         <w:drawing>
           <wp:inline distT="0" distB="0" distL="0" distR="0" wp14:anchorId="6FF80D73" wp14:editId="73EA717C">
@@ -5675,6 +6125,9 @@
         </w:drawing>
       </w:r>
       <w:r>
+        <w:rPr>
+          <w:noProof/>
+        </w:rPr>
         <w:drawing>
           <wp:inline distT="0" distB="0" distL="0" distR="0" wp14:anchorId="6040A98E" wp14:editId="0570F5B4">
             <wp:extent cx="5943600" cy="3289935"/>
@@ -5728,6 +6181,9 @@
         <w:ind w:left="360" w:firstLine="0"/>
       </w:pPr>
       <w:r>
+        <w:rPr>
+          <w:noProof/>
+        </w:rPr>
         <w:lastRenderedPageBreak/>
         <w:drawing>
           <wp:inline distT="0" distB="0" distL="0" distR="0" wp14:anchorId="104CCE83" wp14:editId="14E6E398">
@@ -5766,6 +6222,577 @@
         </w:drawing>
       </w:r>
     </w:p>
+    <w:p>
+      <w:pPr>
+        <w:ind w:left="360" w:firstLine="0"/>
+      </w:pPr>
+      <w:r>
+        <w:rPr>
+          <w:highlight w:val="yellow"/>
+        </w:rPr>
+        <w:t>15/02/2025</w:t>
+      </w:r>
+    </w:p>
+    <w:p>
+      <w:pPr>
+        <w:ind w:left="360" w:firstLine="0"/>
+      </w:pPr>
+    </w:p>
+    <w:p>
+      <w:pPr>
+        <w:ind w:left="360" w:firstLine="0"/>
+      </w:pPr>
+      <w:r>
+        <w:rPr>
+          <w:highlight w:val="yellow"/>
+        </w:rPr>
+        <w:t>Graph:</w:t>
+      </w:r>
+    </w:p>
+    <w:p>
+      <w:pPr>
+        <w:ind w:left="360" w:firstLine="0"/>
+      </w:pPr>
+      <w:r>
+        <w:t>One person connected to many friends</w:t>
+      </w:r>
+    </w:p>
+    <w:p>
+      <w:pPr>
+        <w:ind w:left="360" w:firstLine="0"/>
+      </w:pPr>
+      <w:r>
+        <w:lastRenderedPageBreak/>
+        <w:drawing>
+          <wp:inline distT="0" distB="0" distL="0" distR="0" wp14:anchorId="5A9CCE2F" wp14:editId="2C3AE743">
+            <wp:extent cx="5943600" cy="4208145"/>
+            <wp:effectExtent l="0" t="0" r="0" b="1905"/>
+            <wp:docPr id="1722161043" name="Picture 1"/>
+            <wp:cNvGraphicFramePr>
+              <a:graphicFrameLocks xmlns:a="http://schemas.openxmlformats.org/drawingml/2006/main" noChangeAspect="1"/>
+            </wp:cNvGraphicFramePr>
+            <a:graphic xmlns:a="http://schemas.openxmlformats.org/drawingml/2006/main">
+              <a:graphicData uri="http://schemas.openxmlformats.org/drawingml/2006/picture">
+                <pic:pic xmlns:pic="http://schemas.openxmlformats.org/drawingml/2006/picture">
+                  <pic:nvPicPr>
+                    <pic:cNvPr id="1722161043" name=""/>
+                    <pic:cNvPicPr/>
+                  </pic:nvPicPr>
+                  <pic:blipFill>
+                    <a:blip r:embed="rId70"/>
+                    <a:stretch>
+                      <a:fillRect/>
+                    </a:stretch>
+                  </pic:blipFill>
+                  <pic:spPr>
+                    <a:xfrm>
+                      <a:off x="0" y="0"/>
+                      <a:ext cx="5943600" cy="4208145"/>
+                    </a:xfrm>
+                    <a:prstGeom prst="rect">
+                      <a:avLst/>
+                    </a:prstGeom>
+                  </pic:spPr>
+                </pic:pic>
+              </a:graphicData>
+            </a:graphic>
+          </wp:inline>
+        </w:drawing>
+      </w:r>
+      <w:r>
+        <w:lastRenderedPageBreak/>
+        <w:drawing>
+          <wp:inline distT="0" distB="0" distL="0" distR="0" wp14:anchorId="642647F3" wp14:editId="52210608">
+            <wp:extent cx="5943600" cy="4453255"/>
+            <wp:effectExtent l="0" t="0" r="0" b="4445"/>
+            <wp:docPr id="1649507659" name="Picture 1"/>
+            <wp:cNvGraphicFramePr>
+              <a:graphicFrameLocks xmlns:a="http://schemas.openxmlformats.org/drawingml/2006/main" noChangeAspect="1"/>
+            </wp:cNvGraphicFramePr>
+            <a:graphic xmlns:a="http://schemas.openxmlformats.org/drawingml/2006/main">
+              <a:graphicData uri="http://schemas.openxmlformats.org/drawingml/2006/picture">
+                <pic:pic xmlns:pic="http://schemas.openxmlformats.org/drawingml/2006/picture">
+                  <pic:nvPicPr>
+                    <pic:cNvPr id="1649507659" name=""/>
+                    <pic:cNvPicPr/>
+                  </pic:nvPicPr>
+                  <pic:blipFill>
+                    <a:blip r:embed="rId71"/>
+                    <a:stretch>
+                      <a:fillRect/>
+                    </a:stretch>
+                  </pic:blipFill>
+                  <pic:spPr>
+                    <a:xfrm>
+                      <a:off x="0" y="0"/>
+                      <a:ext cx="5943600" cy="4453255"/>
+                    </a:xfrm>
+                    <a:prstGeom prst="rect">
+                      <a:avLst/>
+                    </a:prstGeom>
+                  </pic:spPr>
+                </pic:pic>
+              </a:graphicData>
+            </a:graphic>
+          </wp:inline>
+        </w:drawing>
+      </w:r>
+    </w:p>
+    <w:p>
+      <w:pPr>
+        <w:ind w:left="360" w:firstLine="0"/>
+      </w:pPr>
+      <w:r>
+        <w:rPr>
+          <w:highlight w:val="yellow"/>
+        </w:rPr>
+        <w:t>Output:</w:t>
+      </w:r>
+    </w:p>
+    <w:p>
+      <w:pPr>
+        <w:ind w:left="360" w:firstLine="0"/>
+      </w:pPr>
+      <w:r>
+        <w:lastRenderedPageBreak/>
+        <w:drawing>
+          <wp:inline distT="0" distB="0" distL="0" distR="0" wp14:anchorId="48036BF0" wp14:editId="4650A46A">
+            <wp:extent cx="4086795" cy="4258269"/>
+            <wp:effectExtent l="0" t="0" r="9525" b="9525"/>
+            <wp:docPr id="933544589" name="Picture 1"/>
+            <wp:cNvGraphicFramePr>
+              <a:graphicFrameLocks xmlns:a="http://schemas.openxmlformats.org/drawingml/2006/main" noChangeAspect="1"/>
+            </wp:cNvGraphicFramePr>
+            <a:graphic xmlns:a="http://schemas.openxmlformats.org/drawingml/2006/main">
+              <a:graphicData uri="http://schemas.openxmlformats.org/drawingml/2006/picture">
+                <pic:pic xmlns:pic="http://schemas.openxmlformats.org/drawingml/2006/picture">
+                  <pic:nvPicPr>
+                    <pic:cNvPr id="933544589" name=""/>
+                    <pic:cNvPicPr/>
+                  </pic:nvPicPr>
+                  <pic:blipFill>
+                    <a:blip r:embed="rId72"/>
+                    <a:stretch>
+                      <a:fillRect/>
+                    </a:stretch>
+                  </pic:blipFill>
+                  <pic:spPr>
+                    <a:xfrm>
+                      <a:off x="0" y="0"/>
+                      <a:ext cx="4086795" cy="4258269"/>
+                    </a:xfrm>
+                    <a:prstGeom prst="rect">
+                      <a:avLst/>
+                    </a:prstGeom>
+                  </pic:spPr>
+                </pic:pic>
+              </a:graphicData>
+            </a:graphic>
+          </wp:inline>
+        </w:drawing>
+      </w:r>
+    </w:p>
+    <w:p>
+      <w:pPr>
+        <w:ind w:left="360" w:firstLine="0"/>
+      </w:pPr>
+    </w:p>
+    <w:p>
+      <w:pPr>
+        <w:ind w:left="360" w:firstLine="0"/>
+      </w:pPr>
+      <w:r>
+        <w:rPr>
+          <w:highlight w:val="yellow"/>
+        </w:rPr>
+        <w:t>Sorting</w:t>
+      </w:r>
+    </w:p>
+    <w:p>
+      <w:pPr>
+        <w:ind w:left="360" w:firstLine="0"/>
+      </w:pPr>
+      <w:r>
+        <w:t>You can write programs to sort the data, types of sorting</w:t>
+      </w:r>
+    </w:p>
+    <w:p>
+      <w:pPr>
+        <w:pStyle w:val="ListParagraph"/>
+        <w:numPr>
+          <w:ilvl w:val="0"/>
+          <w:numId w:val="11"/>
+        </w:numPr>
+      </w:pPr>
+      <w:r>
+        <w:t>Bubble sort</w:t>
+      </w:r>
+    </w:p>
+    <w:p>
+      <w:pPr>
+        <w:pStyle w:val="ListParagraph"/>
+        <w:numPr>
+          <w:ilvl w:val="0"/>
+          <w:numId w:val="11"/>
+        </w:numPr>
+      </w:pPr>
+      <w:r>
+        <w:t>Selection sort</w:t>
+      </w:r>
+    </w:p>
+    <w:p>
+      <w:pPr>
+        <w:pStyle w:val="ListParagraph"/>
+        <w:numPr>
+          <w:ilvl w:val="0"/>
+          <w:numId w:val="11"/>
+        </w:numPr>
+      </w:pPr>
+      <w:r>
+        <w:t>Insertion sort</w:t>
+      </w:r>
+    </w:p>
+    <w:p>
+      <w:pPr>
+        <w:pStyle w:val="ListParagraph"/>
+        <w:numPr>
+          <w:ilvl w:val="0"/>
+          <w:numId w:val="11"/>
+        </w:numPr>
+      </w:pPr>
+      <w:r>
+        <w:t>Merge sort</w:t>
+      </w:r>
+    </w:p>
+    <w:p>
+      <w:pPr>
+        <w:ind w:left="0" w:firstLine="0"/>
+      </w:pPr>
+      <w:r>
+        <w:rPr>
+          <w:highlight w:val="yellow"/>
+        </w:rPr>
+        <w:t>Bubble sort:</w:t>
+      </w:r>
+      <w:r>
+        <w:t xml:space="preserve"> Here you will compare two numbers and swap them if they are in wrong order</w:t>
+      </w:r>
+    </w:p>
+    <w:p>
+      <w:pPr>
+        <w:ind w:left="0" w:firstLine="0"/>
+      </w:pPr>
+      <w:r>
+        <w:rPr>
+          <w:highlight w:val="yellow"/>
+        </w:rPr>
+        <w:t>Selection sort:</w:t>
+      </w:r>
+      <w:r>
+        <w:t xml:space="preserve"> You fill find the smallest number &amp; put in the correct place</w:t>
+      </w:r>
+    </w:p>
+    <w:p>
+      <w:pPr>
+        <w:ind w:left="0" w:firstLine="0"/>
+      </w:pPr>
+      <w:r>
+        <w:rPr>
+          <w:highlight w:val="yellow"/>
+        </w:rPr>
+        <w:t>Insertion sort:</w:t>
+      </w:r>
+      <w:r>
+        <w:t xml:space="preserve"> Compare and insert in</w:t>
+      </w:r>
+      <w:r>
+        <w:t xml:space="preserve"> the</w:t>
+      </w:r>
+      <w:r>
+        <w:t xml:space="preserve"> correct posit</w:t>
+      </w:r>
+      <w:r>
+        <w:t xml:space="preserve">ion </w:t>
+      </w:r>
+    </w:p>
+    <w:p>
+      <w:pPr>
+        <w:ind w:left="0" w:firstLine="0"/>
+      </w:pPr>
+      <w:r>
+        <w:rPr>
+          <w:highlight w:val="yellow"/>
+        </w:rPr>
+        <w:t>Merge sort:</w:t>
+      </w:r>
+      <w:r>
+        <w:t xml:space="preserve"> Divide and </w:t>
+      </w:r>
+      <w:proofErr w:type="gramStart"/>
+      <w:r>
+        <w:t>conquer(</w:t>
+      </w:r>
+      <w:proofErr w:type="gramEnd"/>
+      <w:r>
+        <w:t>Sort while joining)</w:t>
+      </w:r>
+    </w:p>
+    <w:p>
+      <w:pPr>
+        <w:ind w:left="0" w:firstLine="0"/>
+      </w:pPr>
+    </w:p>
+    <w:p>
+      <w:pPr>
+        <w:ind w:left="0" w:firstLine="0"/>
+      </w:pPr>
+      <w:r>
+        <w:rPr>
+          <w:highlight w:val="yellow"/>
+        </w:rPr>
+        <w:t>You can choose sorting based on the factors</w:t>
+      </w:r>
+    </w:p>
+    <w:p>
+      <w:pPr>
+        <w:pStyle w:val="ListParagraph"/>
+        <w:numPr>
+          <w:ilvl w:val="0"/>
+          <w:numId w:val="12"/>
+        </w:numPr>
+      </w:pPr>
+      <w:r>
+        <w:t>Data size (small vs large)</w:t>
+      </w:r>
+    </w:p>
+    <w:p>
+      <w:pPr>
+        <w:pStyle w:val="ListParagraph"/>
+        <w:numPr>
+          <w:ilvl w:val="0"/>
+          <w:numId w:val="12"/>
+        </w:numPr>
+      </w:pPr>
+      <w:r>
+        <w:t>Data condition (already sorted or random)</w:t>
+      </w:r>
+    </w:p>
+    <w:p>
+      <w:pPr>
+        <w:pStyle w:val="ListParagraph"/>
+        <w:numPr>
+          <w:ilvl w:val="0"/>
+          <w:numId w:val="12"/>
+        </w:numPr>
+      </w:pPr>
+      <w:r>
+        <w:t xml:space="preserve">Memory available </w:t>
+      </w:r>
+    </w:p>
+    <w:p>
+      <w:pPr>
+        <w:pStyle w:val="ListParagraph"/>
+        <w:numPr>
+          <w:ilvl w:val="0"/>
+          <w:numId w:val="12"/>
+        </w:numPr>
+      </w:pPr>
+      <w:r>
+        <w:t>Number of swaps allowed</w:t>
+      </w:r>
+    </w:p>
+    <w:p>
+      <w:pPr>
+        <w:ind w:left="0" w:firstLine="0"/>
+      </w:pPr>
+      <w:r>
+        <w:rPr>
+          <w:highlight w:val="yellow"/>
+        </w:rPr>
+        <w:t>Bubble sort</w:t>
+      </w:r>
+    </w:p>
+    <w:p>
+      <w:pPr>
+        <w:ind w:left="0" w:firstLine="0"/>
+      </w:pPr>
+      <w:r>
+        <w:drawing>
+          <wp:inline distT="0" distB="0" distL="0" distR="0" wp14:anchorId="39191EFD" wp14:editId="5C046DFA">
+            <wp:extent cx="5943600" cy="4443730"/>
+            <wp:effectExtent l="0" t="0" r="0" b="0"/>
+            <wp:docPr id="1760448430" name="Picture 1"/>
+            <wp:cNvGraphicFramePr>
+              <a:graphicFrameLocks xmlns:a="http://schemas.openxmlformats.org/drawingml/2006/main" noChangeAspect="1"/>
+            </wp:cNvGraphicFramePr>
+            <a:graphic xmlns:a="http://schemas.openxmlformats.org/drawingml/2006/main">
+              <a:graphicData uri="http://schemas.openxmlformats.org/drawingml/2006/picture">
+                <pic:pic xmlns:pic="http://schemas.openxmlformats.org/drawingml/2006/picture">
+                  <pic:nvPicPr>
+                    <pic:cNvPr id="1760448430" name=""/>
+                    <pic:cNvPicPr/>
+                  </pic:nvPicPr>
+                  <pic:blipFill>
+                    <a:blip r:embed="rId73"/>
+                    <a:stretch>
+                      <a:fillRect/>
+                    </a:stretch>
+                  </pic:blipFill>
+                  <pic:spPr>
+                    <a:xfrm>
+                      <a:off x="0" y="0"/>
+                      <a:ext cx="5943600" cy="4443730"/>
+                    </a:xfrm>
+                    <a:prstGeom prst="rect">
+                      <a:avLst/>
+                    </a:prstGeom>
+                  </pic:spPr>
+                </pic:pic>
+              </a:graphicData>
+            </a:graphic>
+          </wp:inline>
+        </w:drawing>
+      </w:r>
+    </w:p>
+    <w:p>
+      <w:pPr>
+        <w:ind w:left="0" w:firstLine="0"/>
+      </w:pPr>
+      <w:r>
+        <w:rPr>
+          <w:highlight w:val="yellow"/>
+        </w:rPr>
+        <w:t>Output:</w:t>
+      </w:r>
+    </w:p>
+    <w:p>
+      <w:pPr>
+        <w:ind w:left="0" w:firstLine="0"/>
+      </w:pPr>
+      <w:r>
+        <w:lastRenderedPageBreak/>
+        <w:drawing>
+          <wp:inline distT="0" distB="0" distL="0" distR="0" wp14:anchorId="3D5A25FE" wp14:editId="467053FF">
+            <wp:extent cx="4020111" cy="1419423"/>
+            <wp:effectExtent l="0" t="0" r="0" b="9525"/>
+            <wp:docPr id="313063869" name="Picture 1"/>
+            <wp:cNvGraphicFramePr>
+              <a:graphicFrameLocks xmlns:a="http://schemas.openxmlformats.org/drawingml/2006/main" noChangeAspect="1"/>
+            </wp:cNvGraphicFramePr>
+            <a:graphic xmlns:a="http://schemas.openxmlformats.org/drawingml/2006/main">
+              <a:graphicData uri="http://schemas.openxmlformats.org/drawingml/2006/picture">
+                <pic:pic xmlns:pic="http://schemas.openxmlformats.org/drawingml/2006/picture">
+                  <pic:nvPicPr>
+                    <pic:cNvPr id="313063869" name=""/>
+                    <pic:cNvPicPr/>
+                  </pic:nvPicPr>
+                  <pic:blipFill>
+                    <a:blip r:embed="rId74"/>
+                    <a:stretch>
+                      <a:fillRect/>
+                    </a:stretch>
+                  </pic:blipFill>
+                  <pic:spPr>
+                    <a:xfrm>
+                      <a:off x="0" y="0"/>
+                      <a:ext cx="4020111" cy="1419423"/>
+                    </a:xfrm>
+                    <a:prstGeom prst="rect">
+                      <a:avLst/>
+                    </a:prstGeom>
+                  </pic:spPr>
+                </pic:pic>
+              </a:graphicData>
+            </a:graphic>
+          </wp:inline>
+        </w:drawing>
+      </w:r>
+    </w:p>
+    <w:p>
+      <w:pPr>
+        <w:ind w:left="0" w:firstLine="0"/>
+      </w:pPr>
+      <w:r>
+        <w:rPr>
+          <w:highlight w:val="yellow"/>
+        </w:rPr>
+        <w:t>Project work</w:t>
+      </w:r>
+    </w:p>
+    <w:p>
+      <w:pPr>
+        <w:ind w:left="0" w:firstLine="0"/>
+      </w:pPr>
+      <w:r>
+        <w:t xml:space="preserve">You must create Nodes one for LinkedList &amp; another for </w:t>
+      </w:r>
+      <w:proofErr w:type="spellStart"/>
+      <w:r>
+        <w:t>BinaryTree</w:t>
+      </w:r>
+      <w:proofErr w:type="spellEnd"/>
+      <w:r>
+        <w:t xml:space="preserve">, a Bank class that will perform following operations like </w:t>
+      </w:r>
+      <w:proofErr w:type="spellStart"/>
+      <w:proofErr w:type="gramStart"/>
+      <w:r>
+        <w:t>addAccount</w:t>
+      </w:r>
+      <w:proofErr w:type="spellEnd"/>
+      <w:r>
+        <w:t>(</w:t>
+      </w:r>
+      <w:proofErr w:type="gramEnd"/>
+      <w:r>
+        <w:t xml:space="preserve">), </w:t>
+      </w:r>
+      <w:proofErr w:type="spellStart"/>
+      <w:proofErr w:type="gramStart"/>
+      <w:r>
+        <w:t>checkBalance</w:t>
+      </w:r>
+      <w:proofErr w:type="spellEnd"/>
+      <w:r>
+        <w:t>(</w:t>
+      </w:r>
+      <w:proofErr w:type="gramEnd"/>
+      <w:r>
+        <w:t xml:space="preserve">), </w:t>
+      </w:r>
+      <w:proofErr w:type="gramStart"/>
+      <w:r>
+        <w:t>transfer(</w:t>
+      </w:r>
+      <w:proofErr w:type="gramEnd"/>
+      <w:r>
+        <w:t>)</w:t>
+      </w:r>
+    </w:p>
+    <w:p>
+      <w:pPr>
+        <w:ind w:left="0" w:firstLine="0"/>
+      </w:pPr>
+      <w:r>
+        <w:t xml:space="preserve">Using LinkedList &amp; </w:t>
+      </w:r>
+      <w:proofErr w:type="spellStart"/>
+      <w:r>
+        <w:t>BinaryTree</w:t>
+      </w:r>
+      <w:proofErr w:type="spellEnd"/>
+      <w:r>
+        <w:t xml:space="preserve"> you must able to manage the account</w:t>
+      </w:r>
+      <w:r>
+        <w:t>.</w:t>
+      </w:r>
+    </w:p>
+    <w:p>
+      <w:pPr>
+        <w:ind w:left="0" w:firstLine="0"/>
+      </w:pPr>
+    </w:p>
     <w:sectPr>
       <w:pgSz w:w="12240" w:h="15840"/>
       <w:pgMar w:top="1440" w:right="1440" w:bottom="1440" w:left="1440" w:header="720" w:footer="720" w:gutter="0"/>
@@ -6248,6 +7275,95 @@
     </w:lvl>
   </w:abstractNum>
   <w:abstractNum w:abstractNumId="5" w15:restartNumberingAfterBreak="0">
+    <w:nsid w:val="3FE86C10"/>
+    <w:multiLevelType w:val="hybridMultilevel"/>
+    <w:tmpl w:val="C6E4C9D8"/>
+    <w:lvl w:ilvl="0" w:tplc="0409000F">
+      <w:start w:val="1"/>
+      <w:numFmt w:val="decimal"/>
+      <w:lvlText w:val="%1."/>
+      <w:lvlJc w:val="left"/>
+      <w:pPr>
+        <w:ind w:left="720" w:hanging="360"/>
+      </w:pPr>
+      <w:rPr>
+        <w:rFonts w:hint="default"/>
+      </w:rPr>
+    </w:lvl>
+    <w:lvl w:ilvl="1" w:tplc="04090019" w:tentative="1">
+      <w:start w:val="1"/>
+      <w:numFmt w:val="lowerLetter"/>
+      <w:lvlText w:val="%2."/>
+      <w:lvlJc w:val="left"/>
+      <w:pPr>
+        <w:ind w:left="1440" w:hanging="360"/>
+      </w:pPr>
+    </w:lvl>
+    <w:lvl w:ilvl="2" w:tplc="0409001B" w:tentative="1">
+      <w:start w:val="1"/>
+      <w:numFmt w:val="lowerRoman"/>
+      <w:lvlText w:val="%3."/>
+      <w:lvlJc w:val="right"/>
+      <w:pPr>
+        <w:ind w:left="2160" w:hanging="180"/>
+      </w:pPr>
+    </w:lvl>
+    <w:lvl w:ilvl="3" w:tplc="0409000F" w:tentative="1">
+      <w:start w:val="1"/>
+      <w:numFmt w:val="decimal"/>
+      <w:lvlText w:val="%4."/>
+      <w:lvlJc w:val="left"/>
+      <w:pPr>
+        <w:ind w:left="2880" w:hanging="360"/>
+      </w:pPr>
+    </w:lvl>
+    <w:lvl w:ilvl="4" w:tplc="04090019" w:tentative="1">
+      <w:start w:val="1"/>
+      <w:numFmt w:val="lowerLetter"/>
+      <w:lvlText w:val="%5."/>
+      <w:lvlJc w:val="left"/>
+      <w:pPr>
+        <w:ind w:left="3600" w:hanging="360"/>
+      </w:pPr>
+    </w:lvl>
+    <w:lvl w:ilvl="5" w:tplc="0409001B" w:tentative="1">
+      <w:start w:val="1"/>
+      <w:numFmt w:val="lowerRoman"/>
+      <w:lvlText w:val="%6."/>
+      <w:lvlJc w:val="right"/>
+      <w:pPr>
+        <w:ind w:left="4320" w:hanging="180"/>
+      </w:pPr>
+    </w:lvl>
+    <w:lvl w:ilvl="6" w:tplc="0409000F" w:tentative="1">
+      <w:start w:val="1"/>
+      <w:numFmt w:val="decimal"/>
+      <w:lvlText w:val="%7."/>
+      <w:lvlJc w:val="left"/>
+      <w:pPr>
+        <w:ind w:left="5040" w:hanging="360"/>
+      </w:pPr>
+    </w:lvl>
+    <w:lvl w:ilvl="7" w:tplc="04090019" w:tentative="1">
+      <w:start w:val="1"/>
+      <w:numFmt w:val="lowerLetter"/>
+      <w:lvlText w:val="%8."/>
+      <w:lvlJc w:val="left"/>
+      <w:pPr>
+        <w:ind w:left="5760" w:hanging="360"/>
+      </w:pPr>
+    </w:lvl>
+    <w:lvl w:ilvl="8" w:tplc="0409001B" w:tentative="1">
+      <w:start w:val="1"/>
+      <w:numFmt w:val="lowerRoman"/>
+      <w:lvlText w:val="%9."/>
+      <w:lvlJc w:val="right"/>
+      <w:pPr>
+        <w:ind w:left="6480" w:hanging="180"/>
+      </w:pPr>
+    </w:lvl>
+  </w:abstractNum>
+  <w:abstractNum w:abstractNumId="6" w15:restartNumberingAfterBreak="0">
     <w:nsid w:val="45E82A95"/>
     <w:multiLevelType w:val="hybridMultilevel"/>
     <w:tmpl w:val="774AB3F2"/>
@@ -6360,7 +7476,96 @@
       </w:rPr>
     </w:lvl>
   </w:abstractNum>
-  <w:abstractNum w:abstractNumId="6" w15:restartNumberingAfterBreak="0">
+  <w:abstractNum w:abstractNumId="7" w15:restartNumberingAfterBreak="0">
+    <w:nsid w:val="484A0E13"/>
+    <w:multiLevelType w:val="hybridMultilevel"/>
+    <w:tmpl w:val="E6C6EBCA"/>
+    <w:lvl w:ilvl="0" w:tplc="0409000F">
+      <w:start w:val="1"/>
+      <w:numFmt w:val="decimal"/>
+      <w:lvlText w:val="%1."/>
+      <w:lvlJc w:val="left"/>
+      <w:pPr>
+        <w:ind w:left="720" w:hanging="360"/>
+      </w:pPr>
+      <w:rPr>
+        <w:rFonts w:hint="default"/>
+      </w:rPr>
+    </w:lvl>
+    <w:lvl w:ilvl="1" w:tplc="04090019" w:tentative="1">
+      <w:start w:val="1"/>
+      <w:numFmt w:val="lowerLetter"/>
+      <w:lvlText w:val="%2."/>
+      <w:lvlJc w:val="left"/>
+      <w:pPr>
+        <w:ind w:left="1440" w:hanging="360"/>
+      </w:pPr>
+    </w:lvl>
+    <w:lvl w:ilvl="2" w:tplc="0409001B" w:tentative="1">
+      <w:start w:val="1"/>
+      <w:numFmt w:val="lowerRoman"/>
+      <w:lvlText w:val="%3."/>
+      <w:lvlJc w:val="right"/>
+      <w:pPr>
+        <w:ind w:left="2160" w:hanging="180"/>
+      </w:pPr>
+    </w:lvl>
+    <w:lvl w:ilvl="3" w:tplc="0409000F" w:tentative="1">
+      <w:start w:val="1"/>
+      <w:numFmt w:val="decimal"/>
+      <w:lvlText w:val="%4."/>
+      <w:lvlJc w:val="left"/>
+      <w:pPr>
+        <w:ind w:left="2880" w:hanging="360"/>
+      </w:pPr>
+    </w:lvl>
+    <w:lvl w:ilvl="4" w:tplc="04090019" w:tentative="1">
+      <w:start w:val="1"/>
+      <w:numFmt w:val="lowerLetter"/>
+      <w:lvlText w:val="%5."/>
+      <w:lvlJc w:val="left"/>
+      <w:pPr>
+        <w:ind w:left="3600" w:hanging="360"/>
+      </w:pPr>
+    </w:lvl>
+    <w:lvl w:ilvl="5" w:tplc="0409001B" w:tentative="1">
+      <w:start w:val="1"/>
+      <w:numFmt w:val="lowerRoman"/>
+      <w:lvlText w:val="%6."/>
+      <w:lvlJc w:val="right"/>
+      <w:pPr>
+        <w:ind w:left="4320" w:hanging="180"/>
+      </w:pPr>
+    </w:lvl>
+    <w:lvl w:ilvl="6" w:tplc="0409000F" w:tentative="1">
+      <w:start w:val="1"/>
+      <w:numFmt w:val="decimal"/>
+      <w:lvlText w:val="%7."/>
+      <w:lvlJc w:val="left"/>
+      <w:pPr>
+        <w:ind w:left="5040" w:hanging="360"/>
+      </w:pPr>
+    </w:lvl>
+    <w:lvl w:ilvl="7" w:tplc="04090019" w:tentative="1">
+      <w:start w:val="1"/>
+      <w:numFmt w:val="lowerLetter"/>
+      <w:lvlText w:val="%8."/>
+      <w:lvlJc w:val="left"/>
+      <w:pPr>
+        <w:ind w:left="5760" w:hanging="360"/>
+      </w:pPr>
+    </w:lvl>
+    <w:lvl w:ilvl="8" w:tplc="0409001B" w:tentative="1">
+      <w:start w:val="1"/>
+      <w:numFmt w:val="lowerRoman"/>
+      <w:lvlText w:val="%9."/>
+      <w:lvlJc w:val="right"/>
+      <w:pPr>
+        <w:ind w:left="6480" w:hanging="180"/>
+      </w:pPr>
+    </w:lvl>
+  </w:abstractNum>
+  <w:abstractNum w:abstractNumId="8" w15:restartNumberingAfterBreak="0">
     <w:nsid w:val="48B92FEE"/>
     <w:multiLevelType w:val="hybridMultilevel"/>
     <w:tmpl w:val="C3541BA2"/>
@@ -6449,7 +7654,7 @@
       </w:pPr>
     </w:lvl>
   </w:abstractNum>
-  <w:abstractNum w:abstractNumId="7" w15:restartNumberingAfterBreak="0">
+  <w:abstractNum w:abstractNumId="9" w15:restartNumberingAfterBreak="0">
     <w:nsid w:val="49756246"/>
     <w:multiLevelType w:val="hybridMultilevel"/>
     <w:tmpl w:val="5BA667DE"/>
@@ -6538,7 +7743,7 @@
       </w:pPr>
     </w:lvl>
   </w:abstractNum>
-  <w:abstractNum w:abstractNumId="8" w15:restartNumberingAfterBreak="0">
+  <w:abstractNum w:abstractNumId="10" w15:restartNumberingAfterBreak="0">
     <w:nsid w:val="64624C27"/>
     <w:multiLevelType w:val="hybridMultilevel"/>
     <w:tmpl w:val="9AF4F35E"/>
@@ -6627,7 +7832,7 @@
       </w:pPr>
     </w:lvl>
   </w:abstractNum>
-  <w:abstractNum w:abstractNumId="9" w15:restartNumberingAfterBreak="0">
+  <w:abstractNum w:abstractNumId="11" w15:restartNumberingAfterBreak="0">
     <w:nsid w:val="7C732410"/>
     <w:multiLevelType w:val="hybridMultilevel"/>
     <w:tmpl w:val="F0602568"/>
@@ -6741,22 +7946,22 @@
     </w:lvl>
   </w:abstractNum>
   <w:num w:numId="1" w16cid:durableId="2138448239">
-    <w:abstractNumId w:val="6"/>
+    <w:abstractNumId w:val="8"/>
   </w:num>
   <w:num w:numId="2" w16cid:durableId="83763953">
-    <w:abstractNumId w:val="7"/>
+    <w:abstractNumId w:val="9"/>
   </w:num>
   <w:num w:numId="3" w16cid:durableId="1804035675">
     <w:abstractNumId w:val="1"/>
   </w:num>
   <w:num w:numId="4" w16cid:durableId="368342229">
-    <w:abstractNumId w:val="8"/>
+    <w:abstractNumId w:val="10"/>
   </w:num>
   <w:num w:numId="5" w16cid:durableId="806316744">
-    <w:abstractNumId w:val="5"/>
+    <w:abstractNumId w:val="6"/>
   </w:num>
   <w:num w:numId="6" w16cid:durableId="342362878">
-    <w:abstractNumId w:val="9"/>
+    <w:abstractNumId w:val="11"/>
   </w:num>
   <w:num w:numId="7" w16cid:durableId="779103049">
     <w:abstractNumId w:val="2"/>
@@ -6769,6 +7974,12 @@
   </w:num>
   <w:num w:numId="10" w16cid:durableId="1738016391">
     <w:abstractNumId w:val="0"/>
+  </w:num>
+  <w:num w:numId="11" w16cid:durableId="1983002606">
+    <w:abstractNumId w:val="5"/>
+  </w:num>
+  <w:num w:numId="12" w16cid:durableId="698165636">
+    <w:abstractNumId w:val="7"/>
   </w:num>
 </w:numbering>
 </file>

</xml_diff>